<commit_message>
Fusion best-of du projet de groupe SmartAgent-IoT
- Base : implémentation lyz (3 modules RMI/MQTT, config openHAB, S2/S3,
  rapport, diagrammes).
- Greffé depuis la variante soso : simulateur en boucle fermée + topics de
  contrôle, scripts d'orchestration (build/start-all/stop-all/demo),
  registre RMI dédié.
- docker-compose portable (ports publiés + network_mode: service:mosquitto) :
  exécutable sous Windows, macOS et Linux.
- README : démarrage + section « Lancement sous Windows » ; rapport mis à jour
  (réseau Docker).

Co-Authored-By: Claude Opus 4.8 <noreply@anthropic.com>
</commit_message>
<xml_diff>
--- a/Projet1/smartagent-iot/rapport/Rapport_SmartAgentIoT.docx
+++ b/Projet1/smartagent-iot/rapport/Rapport_SmartAgentIoT.docx
@@ -238,7 +238,7 @@
         </w:rPr>
         <w:t xml:space="preserve">smartagent-iot/</w:t>
         <w:br/>
-        <w:t xml:space="preserve">├── docker-compose.yml        (Mosquitto + openHAB, network_mode: host)</w:t>
+        <w:t xml:space="preserve">├── docker-compose.yml        (Mosquitto + openHAB, ports publiés 1883/8080)</w:t>
         <w:br/>
         <w:t xml:space="preserve">├── mosquitto/config/mosquitto.conf</w:t>
         <w:br/>
@@ -1622,7 +1622,7 @@
         <w:spacing w:after="80"/>
       </w:pPr>
       <w:r>
-        <w:t xml:space="preserve">Mosquitto déployé via Docker Compose (network_mode: host, pour que host="localhost" fonctionne identiquement pour les processus Java hors conteneur et pour openHAB).</w:t>
+        <w:t xml:space="preserve">Mosquitto déployé via Docker Compose (ports 1883/8080 publiés ; openHAB partage le réseau du broker via network_mode: service:mosquitto, pour que host="localhost" reste valide pour les processus Java hors conteneur comme pour openHAB).</w:t>
       </w:r>
     </w:p>
     <w:p>

</xml_diff>